<commit_message>
added generation for parts&supplies
</commit_message>
<xml_diff>
--- a/report_template/tools&eq_temp.docx
+++ b/report_template/tools&eq_temp.docx
@@ -37,21 +37,7 @@
         <w:rPr>
           <w:rFonts w:ascii="Arial" w:eastAsia="Arial" w:hAnsi="Arial" w:cs="Arial"/>
         </w:rPr>
-        <w:t xml:space="preserve"> {{</w:t>
-      </w:r>
-      <w:proofErr w:type="spellStart"/>
-      <w:r>
-        <w:rPr>
-          <w:rFonts w:ascii="Arial" w:eastAsia="Arial" w:hAnsi="Arial" w:cs="Arial"/>
-        </w:rPr>
-        <w:t>generated_by</w:t>
-      </w:r>
-      <w:proofErr w:type="spellEnd"/>
-      <w:r>
-        <w:rPr>
-          <w:rFonts w:ascii="Arial" w:eastAsia="Arial" w:hAnsi="Arial" w:cs="Arial"/>
-        </w:rPr>
-        <w:t>}}</w:t>
+        <w:t xml:space="preserve"> {{generated_by}}</w:t>
       </w:r>
     </w:p>
     <w:p>
@@ -73,21 +59,7 @@
         <w:rPr>
           <w:rFonts w:ascii="Arial" w:eastAsia="Arial" w:hAnsi="Arial" w:cs="Arial"/>
         </w:rPr>
-        <w:t xml:space="preserve"> {{</w:t>
-      </w:r>
-      <w:proofErr w:type="spellStart"/>
-      <w:r>
-        <w:rPr>
-          <w:rFonts w:ascii="Arial" w:eastAsia="Arial" w:hAnsi="Arial" w:cs="Arial"/>
-        </w:rPr>
-        <w:t>generated_on</w:t>
-      </w:r>
-      <w:proofErr w:type="spellEnd"/>
-      <w:r>
-        <w:rPr>
-          <w:rFonts w:ascii="Arial" w:eastAsia="Arial" w:hAnsi="Arial" w:cs="Arial"/>
-        </w:rPr>
-        <w:t>}}</w:t>
+        <w:t xml:space="preserve"> {{generated_on}}</w:t>
       </w:r>
     </w:p>
     <w:p>
@@ -146,7 +118,23 @@
           <w:b/>
           <w:bCs/>
         </w:rPr>
-        <w:t>TOOLA AND EQUIPMENT REPORT</w:t>
+        <w:t>TOOL</w:t>
+      </w:r>
+      <w:r>
+        <w:rPr>
+          <w:rFonts w:ascii="Arial" w:eastAsia="Arial" w:hAnsi="Arial" w:cs="Arial"/>
+          <w:b/>
+          <w:bCs/>
+        </w:rPr>
+        <w:t>S</w:t>
+      </w:r>
+      <w:r>
+        <w:rPr>
+          <w:rFonts w:ascii="Arial" w:eastAsia="Arial" w:hAnsi="Arial" w:cs="Arial"/>
+          <w:b/>
+          <w:bCs/>
+        </w:rPr>
+        <w:t xml:space="preserve"> AND EQUIPMENT REPORT</w:t>
       </w:r>
       <w:r>
         <w:rPr>
@@ -163,27 +151,7 @@
           <w:bCs/>
           <w:u w:val="single"/>
         </w:rPr>
-        <w:t>{{</w:t>
-      </w:r>
-      <w:proofErr w:type="spellStart"/>
-      <w:r>
-        <w:rPr>
-          <w:rFonts w:ascii="Arial" w:eastAsia="Arial" w:hAnsi="Arial" w:cs="Arial"/>
-          <w:b/>
-          <w:bCs/>
-          <w:u w:val="single"/>
-        </w:rPr>
-        <w:t>month_year</w:t>
-      </w:r>
-      <w:proofErr w:type="spellEnd"/>
-      <w:r>
-        <w:rPr>
-          <w:rFonts w:ascii="Arial" w:eastAsia="Arial" w:hAnsi="Arial" w:cs="Arial"/>
-          <w:b/>
-          <w:bCs/>
-          <w:u w:val="single"/>
-        </w:rPr>
-        <w:t>}}</w:t>
+        <w:t>{{month_year}}</w:t>
       </w:r>
       <w:r>
         <w:rPr>
@@ -527,21 +495,7 @@
         <w:rPr>
           <w:rFonts w:ascii="Arial" w:eastAsia="Arial" w:hAnsi="Arial" w:cs="Arial"/>
         </w:rPr>
-        <w:t xml:space="preserve"> {{</w:t>
-      </w:r>
-      <w:proofErr w:type="spellStart"/>
-      <w:r>
-        <w:rPr>
-          <w:rFonts w:ascii="Arial" w:eastAsia="Arial" w:hAnsi="Arial" w:cs="Arial"/>
-        </w:rPr>
-        <w:t>total_items</w:t>
-      </w:r>
-      <w:proofErr w:type="spellEnd"/>
-      <w:r>
-        <w:rPr>
-          <w:rFonts w:ascii="Arial" w:eastAsia="Arial" w:hAnsi="Arial" w:cs="Arial"/>
-        </w:rPr>
-        <w:t>}}</w:t>
+        <w:t xml:space="preserve"> {{total_items}}</w:t>
       </w:r>
     </w:p>
     <w:p>
@@ -670,19 +624,11 @@
         </w:rPr>
         <w:t>{</w:t>
       </w:r>
-      <w:proofErr w:type="spellStart"/>
-      <w:r>
-        <w:rPr>
-          <w:rFonts w:ascii="Arial" w:eastAsia="Arial" w:hAnsi="Arial" w:cs="Arial"/>
-        </w:rPr>
-        <w:t>most_qty</w:t>
-      </w:r>
-      <w:proofErr w:type="spellEnd"/>
-      <w:r>
-        <w:rPr>
-          <w:rFonts w:ascii="Arial" w:eastAsia="Arial" w:hAnsi="Arial" w:cs="Arial"/>
-        </w:rPr>
-        <w:t>}}</w:t>
+      <w:r>
+        <w:rPr>
+          <w:rFonts w:ascii="Arial" w:eastAsia="Arial" w:hAnsi="Arial" w:cs="Arial"/>
+        </w:rPr>
+        <w:t>most_qty}}</w:t>
       </w:r>
     </w:p>
     <w:p>
@@ -711,14 +657,7 @@
         <w:rPr>
           <w:rFonts w:ascii="Arial" w:eastAsia="Arial" w:hAnsi="Arial" w:cs="Arial"/>
         </w:rPr>
-        <w:t xml:space="preserve"> {{</w:t>
-      </w:r>
-      <w:proofErr w:type="spellStart"/>
-      <w:r>
-        <w:rPr>
-          <w:rFonts w:ascii="Arial" w:eastAsia="Arial" w:hAnsi="Arial" w:cs="Arial"/>
-        </w:rPr>
-        <w:t>l</w:t>
+        <w:t xml:space="preserve"> {{l</w:t>
       </w:r>
       <w:r>
         <w:rPr>
@@ -730,14 +669,7 @@
         <w:rPr>
           <w:rFonts w:ascii="Arial" w:eastAsia="Arial" w:hAnsi="Arial" w:cs="Arial"/>
         </w:rPr>
-        <w:t>_qty</w:t>
-      </w:r>
-      <w:proofErr w:type="spellEnd"/>
-      <w:r>
-        <w:rPr>
-          <w:rFonts w:ascii="Arial" w:eastAsia="Arial" w:hAnsi="Arial" w:cs="Arial"/>
-        </w:rPr>
-        <w:t>}}</w:t>
+        <w:t>_qty}}</w:t>
       </w:r>
     </w:p>
     <w:p>
@@ -1143,27 +1075,7 @@
         <w:sz w:val="22"/>
         <w:szCs w:val="22"/>
       </w:rPr>
-      <w:t xml:space="preserve">PUP A. Mabini Campus, </w:t>
-    </w:r>
-    <w:proofErr w:type="spellStart"/>
-    <w:r>
-      <w:rPr>
-        <w:rFonts w:ascii="Times New Roman" w:eastAsia="Times New Roman" w:hAnsi="Times New Roman" w:cs="Times New Roman"/>
-        <w:color w:val="000000"/>
-        <w:sz w:val="22"/>
-        <w:szCs w:val="22"/>
-      </w:rPr>
-      <w:t>Anonas</w:t>
-    </w:r>
-    <w:proofErr w:type="spellEnd"/>
-    <w:r>
-      <w:rPr>
-        <w:rFonts w:ascii="Times New Roman" w:eastAsia="Times New Roman" w:hAnsi="Times New Roman" w:cs="Times New Roman"/>
-        <w:color w:val="000000"/>
-        <w:sz w:val="22"/>
-        <w:szCs w:val="22"/>
-      </w:rPr>
-      <w:t xml:space="preserve"> Street, Sta. Mesa, Manila 1016</w:t>
+      <w:t>PUP A. Mabini Campus, Anonas Street, Sta. Mesa, Manila 1016</w:t>
     </w:r>
   </w:p>
   <w:p>

</xml_diff>